<commit_message>
docs: add failure scenarios to user stories (ar + en)
</commit_message>
<xml_diff>
--- a/User Stories (English).docx
+++ b/User Stories (English).docx
@@ -309,6 +309,102 @@
     </w:p>
     <w:p>
       <w:pPr>
+        <w:spacing w:after="60"/>
+      </w:pPr>
+      <w:r>
+        <w:rPr>
+          <w:rFonts w:ascii="Calibri" w:cs="Calibri" w:eastAsia="Calibri" w:hAnsi="Calibri"/>
+          <w:b/>
+          <w:bCs/>
+          <w:color w:val="C62828"/>
+          <w:sz w:val="23"/>
+          <w:szCs w:val="23"/>
+        </w:rPr>
+        <w:t xml:space="preserve">Failure scenarios:</w:t>
+      </w:r>
+    </w:p>
+    <w:p>
+      <w:pPr>
+        <w:pStyle w:val="ListParagraph"/>
+        <w:numPr>
+          <w:ilvl w:val="0"/>
+          <w:numId w:val="2"/>
+        </w:numPr>
+        <w:spacing w:after="100"/>
+      </w:pPr>
+      <w:r>
+        <w:rPr>
+          <w:rFonts w:ascii="Calibri" w:cs="Calibri" w:eastAsia="Calibri" w:hAnsi="Calibri"/>
+          <w:b w:val="false"/>
+          <w:bCs w:val="false"/>
+          <w:sz w:val="23"/>
+          <w:szCs w:val="23"/>
+        </w:rPr>
+        <w:t xml:space="preserve">Duplicate email: rejected with HTTP 409 and a clear message; no account is created.</w:t>
+      </w:r>
+    </w:p>
+    <w:p>
+      <w:pPr>
+        <w:pStyle w:val="ListParagraph"/>
+        <w:numPr>
+          <w:ilvl w:val="0"/>
+          <w:numId w:val="2"/>
+        </w:numPr>
+        <w:spacing w:after="100"/>
+      </w:pPr>
+      <w:r>
+        <w:rPr>
+          <w:rFonts w:ascii="Calibri" w:cs="Calibri" w:eastAsia="Calibri" w:hAnsi="Calibri"/>
+          <w:b w:val="false"/>
+          <w:bCs w:val="false"/>
+          <w:sz w:val="23"/>
+          <w:szCs w:val="23"/>
+        </w:rPr>
+        <w:t xml:space="preserve">Missing field: rejected with HTTP 400 stating the required fields.</w:t>
+      </w:r>
+    </w:p>
+    <w:p>
+      <w:pPr>
+        <w:pStyle w:val="ListParagraph"/>
+        <w:numPr>
+          <w:ilvl w:val="0"/>
+          <w:numId w:val="2"/>
+        </w:numPr>
+        <w:spacing w:after="100"/>
+      </w:pPr>
+      <w:r>
+        <w:rPr>
+          <w:rFonts w:ascii="Calibri" w:cs="Calibri" w:eastAsia="Calibri" w:hAnsi="Calibri"/>
+          <w:b w:val="false"/>
+          <w:bCs w:val="false"/>
+          <w:sz w:val="23"/>
+          <w:szCs w:val="23"/>
+        </w:rPr>
+        <w:t xml:space="preserve">Mismatched or too-short passwords: the form blocks submission and explains why under the field.</w:t>
+      </w:r>
+    </w:p>
+    <w:p>
+      <w:pPr>
+        <w:pStyle w:val="ListParagraph"/>
+        <w:numPr>
+          <w:ilvl w:val="0"/>
+          <w:numId w:val="2"/>
+        </w:numPr>
+        <w:spacing w:after="100"/>
+      </w:pPr>
+      <w:r>
+        <w:rPr>
+          <w:rFonts w:ascii="Calibri" w:cs="Calibri" w:eastAsia="Calibri" w:hAnsi="Calibri"/>
+          <w:b w:val="false"/>
+          <w:bCs w:val="false"/>
+          <w:sz w:val="23"/>
+          <w:szCs w:val="23"/>
+        </w:rPr>
+        <w:t xml:space="preserve">Invalid role sent directly to the API: rejected with HTTP 400.</w:t>
+      </w:r>
+    </w:p>
+    <w:p>
+      <w:pPr>
         <w:pStyle w:val="Heading2"/>
         <w:spacing w:after="100" w:before="220"/>
       </w:pPr>
@@ -476,6 +572,102 @@
     </w:p>
     <w:p>
       <w:pPr>
+        <w:spacing w:after="60"/>
+      </w:pPr>
+      <w:r>
+        <w:rPr>
+          <w:rFonts w:ascii="Calibri" w:cs="Calibri" w:eastAsia="Calibri" w:hAnsi="Calibri"/>
+          <w:b/>
+          <w:bCs/>
+          <w:color w:val="C62828"/>
+          <w:sz w:val="23"/>
+          <w:szCs w:val="23"/>
+        </w:rPr>
+        <w:t xml:space="preserve">Failure scenarios:</w:t>
+      </w:r>
+    </w:p>
+    <w:p>
+      <w:pPr>
+        <w:pStyle w:val="ListParagraph"/>
+        <w:numPr>
+          <w:ilvl w:val="0"/>
+          <w:numId w:val="2"/>
+        </w:numPr>
+        <w:spacing w:after="100"/>
+      </w:pPr>
+      <w:r>
+        <w:rPr>
+          <w:rFonts w:ascii="Calibri" w:cs="Calibri" w:eastAsia="Calibri" w:hAnsi="Calibri"/>
+          <w:b w:val="false"/>
+          <w:bCs w:val="false"/>
+          <w:sz w:val="23"/>
+          <w:szCs w:val="23"/>
+        </w:rPr>
+        <w:t xml:space="preserve">Unknown email or wrong password: HTTP 401 with one unified message that never reveals which one was wrong.</w:t>
+      </w:r>
+    </w:p>
+    <w:p>
+      <w:pPr>
+        <w:pStyle w:val="ListParagraph"/>
+        <w:numPr>
+          <w:ilvl w:val="0"/>
+          <w:numId w:val="2"/>
+        </w:numPr>
+        <w:spacing w:after="100"/>
+      </w:pPr>
+      <w:r>
+        <w:rPr>
+          <w:rFonts w:ascii="Calibri" w:cs="Calibri" w:eastAsia="Calibri" w:hAnsi="Calibri"/>
+          <w:b w:val="false"/>
+          <w:bCs w:val="false"/>
+          <w:sz w:val="23"/>
+          <w:szCs w:val="23"/>
+        </w:rPr>
+        <w:t xml:space="preserve">Empty fields: HTTP 400.</w:t>
+      </w:r>
+    </w:p>
+    <w:p>
+      <w:pPr>
+        <w:pStyle w:val="ListParagraph"/>
+        <w:numPr>
+          <w:ilvl w:val="0"/>
+          <w:numId w:val="2"/>
+        </w:numPr>
+        <w:spacing w:after="100"/>
+      </w:pPr>
+      <w:r>
+        <w:rPr>
+          <w:rFonts w:ascii="Calibri" w:cs="Calibri" w:eastAsia="Calibri" w:hAnsi="Calibri"/>
+          <w:b w:val="false"/>
+          <w:bCs w:val="false"/>
+          <w:sz w:val="23"/>
+          <w:szCs w:val="23"/>
+        </w:rPr>
+        <w:t xml:space="preserve">Network down or server offline: a clear "cannot reach server" message, no crash.</w:t>
+      </w:r>
+    </w:p>
+    <w:p>
+      <w:pPr>
+        <w:pStyle w:val="ListParagraph"/>
+        <w:numPr>
+          <w:ilvl w:val="0"/>
+          <w:numId w:val="2"/>
+        </w:numPr>
+        <w:spacing w:after="100"/>
+      </w:pPr>
+      <w:r>
+        <w:rPr>
+          <w:rFonts w:ascii="Calibri" w:cs="Calibri" w:eastAsia="Calibri" w:hAnsi="Calibri"/>
+          <w:b w:val="false"/>
+          <w:bCs w:val="false"/>
+          <w:sz w:val="23"/>
+          <w:szCs w:val="23"/>
+        </w:rPr>
+        <w:t xml:space="preserve">Token expired after 7 days: protected requests are rejected and the user returns to the login screen.</w:t>
+      </w:r>
+    </w:p>
+    <w:p>
+      <w:pPr>
         <w:pStyle w:val="Heading2"/>
         <w:spacing w:after="100" w:before="220"/>
       </w:pPr>
@@ -732,6 +924,62 @@
     </w:p>
     <w:p>
       <w:pPr>
+        <w:spacing w:after="60"/>
+      </w:pPr>
+      <w:r>
+        <w:rPr>
+          <w:rFonts w:ascii="Calibri" w:cs="Calibri" w:eastAsia="Calibri" w:hAnsi="Calibri"/>
+          <w:b/>
+          <w:bCs/>
+          <w:color w:val="C62828"/>
+          <w:sz w:val="23"/>
+          <w:szCs w:val="23"/>
+        </w:rPr>
+        <w:t xml:space="preserve">Failure scenarios:</w:t>
+      </w:r>
+    </w:p>
+    <w:p>
+      <w:pPr>
+        <w:pStyle w:val="ListParagraph"/>
+        <w:numPr>
+          <w:ilvl w:val="0"/>
+          <w:numId w:val="2"/>
+        </w:numPr>
+        <w:spacing w:after="100"/>
+      </w:pPr>
+      <w:r>
+        <w:rPr>
+          <w:rFonts w:ascii="Calibri" w:cs="Calibri" w:eastAsia="Calibri" w:hAnsi="Calibri"/>
+          <w:b w:val="false"/>
+          <w:bCs w:val="false"/>
+          <w:sz w:val="23"/>
+          <w:szCs w:val="23"/>
+        </w:rPr>
+        <w:t xml:space="preserve">A parent with no linked children sees a friendly empty state, not an error.</w:t>
+      </w:r>
+    </w:p>
+    <w:p>
+      <w:pPr>
+        <w:pStyle w:val="ListParagraph"/>
+        <w:numPr>
+          <w:ilvl w:val="0"/>
+          <w:numId w:val="2"/>
+        </w:numPr>
+        <w:spacing w:after="100"/>
+      </w:pPr>
+      <w:r>
+        <w:rPr>
+          <w:rFonts w:ascii="Calibri" w:cs="Calibri" w:eastAsia="Calibri" w:hAnsi="Calibri"/>
+          <w:b w:val="false"/>
+          <w:bCs w:val="false"/>
+          <w:sz w:val="23"/>
+          <w:szCs w:val="23"/>
+        </w:rPr>
+        <w:t xml:space="preserve">Direct API calls with a parent token still return only that parent's own children.</w:t>
+      </w:r>
+    </w:p>
+    <w:p>
+      <w:pPr>
         <w:pStyle w:val="Heading2"/>
         <w:spacing w:after="100" w:before="220"/>
       </w:pPr>
@@ -1026,6 +1274,82 @@
     </w:p>
     <w:p>
       <w:pPr>
+        <w:spacing w:after="60"/>
+      </w:pPr>
+      <w:r>
+        <w:rPr>
+          <w:rFonts w:ascii="Calibri" w:cs="Calibri" w:eastAsia="Calibri" w:hAnsi="Calibri"/>
+          <w:b/>
+          <w:bCs/>
+          <w:color w:val="C62828"/>
+          <w:sz w:val="23"/>
+          <w:szCs w:val="23"/>
+        </w:rPr>
+        <w:t xml:space="preserve">Failure scenarios:</w:t>
+      </w:r>
+    </w:p>
+    <w:p>
+      <w:pPr>
+        <w:pStyle w:val="ListParagraph"/>
+        <w:numPr>
+          <w:ilvl w:val="0"/>
+          <w:numId w:val="2"/>
+        </w:numPr>
+        <w:spacing w:after="100"/>
+      </w:pPr>
+      <w:r>
+        <w:rPr>
+          <w:rFonts w:ascii="Calibri" w:cs="Calibri" w:eastAsia="Calibri" w:hAnsi="Calibri"/>
+          <w:b w:val="false"/>
+          <w:bCs w:val="false"/>
+          <w:sz w:val="23"/>
+          <w:szCs w:val="23"/>
+        </w:rPr>
+        <w:t xml:space="preserve">A progress-update request with a parent token, even from outside the app: rejected with HTTP 403.</w:t>
+      </w:r>
+    </w:p>
+    <w:p>
+      <w:pPr>
+        <w:pStyle w:val="ListParagraph"/>
+        <w:numPr>
+          <w:ilvl w:val="0"/>
+          <w:numId w:val="2"/>
+        </w:numPr>
+        <w:spacing w:after="100"/>
+      </w:pPr>
+      <w:r>
+        <w:rPr>
+          <w:rFonts w:ascii="Calibri" w:cs="Calibri" w:eastAsia="Calibri" w:hAnsi="Calibri"/>
+          <w:b w:val="false"/>
+          <w:bCs w:val="false"/>
+          <w:sz w:val="23"/>
+          <w:szCs w:val="23"/>
+        </w:rPr>
+        <w:t xml:space="preserve">A request with no token at all: rejected with HTTP 401.</w:t>
+      </w:r>
+    </w:p>
+    <w:p>
+      <w:pPr>
+        <w:pStyle w:val="ListParagraph"/>
+        <w:numPr>
+          <w:ilvl w:val="0"/>
+          <w:numId w:val="2"/>
+        </w:numPr>
+        <w:spacing w:after="100"/>
+      </w:pPr>
+      <w:r>
+        <w:rPr>
+          <w:rFonts w:ascii="Calibri" w:cs="Calibri" w:eastAsia="Calibri" w:hAnsi="Calibri"/>
+          <w:b w:val="false"/>
+          <w:bCs w:val="false"/>
+          <w:sz w:val="23"/>
+          <w:szCs w:val="23"/>
+        </w:rPr>
+        <w:t xml:space="preserve">A tampered or forged token: rejected with HTTP 403.</w:t>
+      </w:r>
+    </w:p>
+    <w:p>
+      <w:pPr>
         <w:pStyle w:val="Heading2"/>
         <w:spacing w:after="100" w:before="220"/>
       </w:pPr>
@@ -1374,6 +1698,62 @@
     </w:p>
     <w:p>
       <w:pPr>
+        <w:spacing w:after="60"/>
+      </w:pPr>
+      <w:r>
+        <w:rPr>
+          <w:rFonts w:ascii="Calibri" w:cs="Calibri" w:eastAsia="Calibri" w:hAnsi="Calibri"/>
+          <w:b/>
+          <w:bCs/>
+          <w:color w:val="C62828"/>
+          <w:sz w:val="23"/>
+          <w:szCs w:val="23"/>
+        </w:rPr>
+        <w:t xml:space="preserve">Failure scenarios:</w:t>
+      </w:r>
+    </w:p>
+    <w:p>
+      <w:pPr>
+        <w:pStyle w:val="ListParagraph"/>
+        <w:numPr>
+          <w:ilvl w:val="0"/>
+          <w:numId w:val="2"/>
+        </w:numPr>
+        <w:spacing w:after="100"/>
+      </w:pPr>
+      <w:r>
+        <w:rPr>
+          <w:rFonts w:ascii="Calibri" w:cs="Calibri" w:eastAsia="Calibri" w:hAnsi="Calibri"/>
+          <w:b w:val="false"/>
+          <w:bCs w:val="false"/>
+          <w:sz w:val="23"/>
+          <w:szCs w:val="23"/>
+        </w:rPr>
+        <w:t xml:space="preserve">Empty title: rejected with HTTP 400.</w:t>
+      </w:r>
+    </w:p>
+    <w:p>
+      <w:pPr>
+        <w:pStyle w:val="ListParagraph"/>
+        <w:numPr>
+          <w:ilvl w:val="0"/>
+          <w:numId w:val="2"/>
+        </w:numPr>
+        <w:spacing w:after="100"/>
+      </w:pPr>
+      <w:r>
+        <w:rPr>
+          <w:rFonts w:ascii="Calibri" w:cs="Calibri" w:eastAsia="Calibri" w:hAnsi="Calibri"/>
+          <w:b w:val="false"/>
+          <w:bCs w:val="false"/>
+          <w:sz w:val="23"/>
+          <w:szCs w:val="23"/>
+        </w:rPr>
+        <w:t xml:space="preserve">A specialist attempting to add a lesson: rejected with HTTP 403.</w:t>
+      </w:r>
+    </w:p>
+    <w:p>
+      <w:pPr>
         <w:pStyle w:val="Heading2"/>
         <w:spacing w:after="100" w:before="220"/>
       </w:pPr>
@@ -1541,6 +1921,82 @@
     </w:p>
     <w:p>
       <w:pPr>
+        <w:spacing w:after="60"/>
+      </w:pPr>
+      <w:r>
+        <w:rPr>
+          <w:rFonts w:ascii="Calibri" w:cs="Calibri" w:eastAsia="Calibri" w:hAnsi="Calibri"/>
+          <w:b/>
+          <w:bCs/>
+          <w:color w:val="C62828"/>
+          <w:sz w:val="23"/>
+          <w:szCs w:val="23"/>
+        </w:rPr>
+        <w:t xml:space="preserve">Failure scenarios:</w:t>
+      </w:r>
+    </w:p>
+    <w:p>
+      <w:pPr>
+        <w:pStyle w:val="ListParagraph"/>
+        <w:numPr>
+          <w:ilvl w:val="0"/>
+          <w:numId w:val="2"/>
+        </w:numPr>
+        <w:spacing w:after="100"/>
+      </w:pPr>
+      <w:r>
+        <w:rPr>
+          <w:rFonts w:ascii="Calibri" w:cs="Calibri" w:eastAsia="Calibri" w:hAnsi="Calibri"/>
+          <w:b w:val="false"/>
+          <w:bCs w:val="false"/>
+          <w:sz w:val="23"/>
+          <w:szCs w:val="23"/>
+        </w:rPr>
+        <w:t xml:space="preserve">Missing child or lesson id: rejected with HTTP 400.</w:t>
+      </w:r>
+    </w:p>
+    <w:p>
+      <w:pPr>
+        <w:pStyle w:val="ListParagraph"/>
+        <w:numPr>
+          <w:ilvl w:val="0"/>
+          <w:numId w:val="2"/>
+        </w:numPr>
+        <w:spacing w:after="100"/>
+      </w:pPr>
+      <w:r>
+        <w:rPr>
+          <w:rFonts w:ascii="Calibri" w:cs="Calibri" w:eastAsia="Calibri" w:hAnsi="Calibri"/>
+          <w:b w:val="false"/>
+          <w:bCs w:val="false"/>
+          <w:sz w:val="23"/>
+          <w:szCs w:val="23"/>
+        </w:rPr>
+        <w:t xml:space="preserve">An unknown status value: rejected with HTTP 400.</w:t>
+      </w:r>
+    </w:p>
+    <w:p>
+      <w:pPr>
+        <w:pStyle w:val="ListParagraph"/>
+        <w:numPr>
+          <w:ilvl w:val="0"/>
+          <w:numId w:val="2"/>
+        </w:numPr>
+        <w:spacing w:after="100"/>
+      </w:pPr>
+      <w:r>
+        <w:rPr>
+          <w:rFonts w:ascii="Calibri" w:cs="Calibri" w:eastAsia="Calibri" w:hAnsi="Calibri"/>
+          <w:b w:val="false"/>
+          <w:bCs w:val="false"/>
+          <w:sz w:val="23"/>
+          <w:szCs w:val="23"/>
+        </w:rPr>
+        <w:t xml:space="preserve">Network failure while saving: a red error message appears and the button stays available for retry — it never falsely shows "Completed".</w:t>
+      </w:r>
+    </w:p>
+    <w:p>
+      <w:pPr>
         <w:pStyle w:val="Heading2"/>
         <w:spacing w:after="100" w:before="220"/>
       </w:pPr>
@@ -1926,6 +2382,62 @@
     </w:p>
     <w:p>
       <w:pPr>
+        <w:spacing w:after="60"/>
+      </w:pPr>
+      <w:r>
+        <w:rPr>
+          <w:rFonts w:ascii="Calibri" w:cs="Calibri" w:eastAsia="Calibri" w:hAnsi="Calibri"/>
+          <w:b/>
+          <w:bCs/>
+          <w:color w:val="C62828"/>
+          <w:sz w:val="23"/>
+          <w:szCs w:val="23"/>
+        </w:rPr>
+        <w:t xml:space="preserve">Failure scenarios:</w:t>
+      </w:r>
+    </w:p>
+    <w:p>
+      <w:pPr>
+        <w:pStyle w:val="ListParagraph"/>
+        <w:numPr>
+          <w:ilvl w:val="0"/>
+          <w:numId w:val="2"/>
+        </w:numPr>
+        <w:spacing w:after="100"/>
+      </w:pPr>
+      <w:r>
+        <w:rPr>
+          <w:rFonts w:ascii="Calibri" w:cs="Calibri" w:eastAsia="Calibri" w:hAnsi="Calibri"/>
+          <w:b w:val="false"/>
+          <w:bCs w:val="false"/>
+          <w:sz w:val="23"/>
+          <w:szCs w:val="23"/>
+        </w:rPr>
+        <w:t xml:space="preserve">Missing parent id: rejected with HTTP 400.</w:t>
+      </w:r>
+    </w:p>
+    <w:p>
+      <w:pPr>
+        <w:pStyle w:val="ListParagraph"/>
+        <w:numPr>
+          <w:ilvl w:val="0"/>
+          <w:numId w:val="2"/>
+        </w:numPr>
+        <w:spacing w:after="100"/>
+      </w:pPr>
+      <w:r>
+        <w:rPr>
+          <w:rFonts w:ascii="Calibri" w:cs="Calibri" w:eastAsia="Calibri" w:hAnsi="Calibri"/>
+          <w:b w:val="false"/>
+          <w:bCs w:val="false"/>
+          <w:sz w:val="23"/>
+          <w:szCs w:val="23"/>
+        </w:rPr>
+        <w:t xml:space="preserve">Linking the same pair twice: safely ignored — no duplicate record, no error.</w:t>
+      </w:r>
+    </w:p>
+    <w:p>
+      <w:pPr>
         <w:pStyle w:val="Heading1"/>
         <w:spacing w:after="160" w:before="320"/>
       </w:pPr>
@@ -2110,6 +2622,62 @@
     </w:p>
     <w:p>
       <w:pPr>
+        <w:spacing w:after="60"/>
+      </w:pPr>
+      <w:r>
+        <w:rPr>
+          <w:rFonts w:ascii="Calibri" w:cs="Calibri" w:eastAsia="Calibri" w:hAnsi="Calibri"/>
+          <w:b/>
+          <w:bCs/>
+          <w:color w:val="C62828"/>
+          <w:sz w:val="23"/>
+          <w:szCs w:val="23"/>
+        </w:rPr>
+        <w:t xml:space="preserve">Failure scenarios:</w:t>
+      </w:r>
+    </w:p>
+    <w:p>
+      <w:pPr>
+        <w:pStyle w:val="ListParagraph"/>
+        <w:numPr>
+          <w:ilvl w:val="0"/>
+          <w:numId w:val="2"/>
+        </w:numPr>
+        <w:spacing w:after="100"/>
+      </w:pPr>
+      <w:r>
+        <w:rPr>
+          <w:rFonts w:ascii="Calibri" w:cs="Calibri" w:eastAsia="Calibri" w:hAnsi="Calibri"/>
+          <w:b w:val="false"/>
+          <w:bCs w:val="false"/>
+          <w:sz w:val="23"/>
+          <w:szCs w:val="23"/>
+        </w:rPr>
+        <w:t xml:space="preserve">A browser without speech support shows a clear explanatory message instead of failing silently.</w:t>
+      </w:r>
+    </w:p>
+    <w:p>
+      <w:pPr>
+        <w:pStyle w:val="ListParagraph"/>
+        <w:numPr>
+          <w:ilvl w:val="0"/>
+          <w:numId w:val="2"/>
+        </w:numPr>
+        <w:spacing w:after="100"/>
+      </w:pPr>
+      <w:r>
+        <w:rPr>
+          <w:rFonts w:ascii="Calibri" w:cs="Calibri" w:eastAsia="Calibri" w:hAnsi="Calibri"/>
+          <w:b w:val="false"/>
+          <w:bCs w:val="false"/>
+          <w:sz w:val="23"/>
+          <w:szCs w:val="23"/>
+        </w:rPr>
+        <w:t xml:space="preserve">Starting another lesson while one is playing automatically stops the first reading.</w:t>
+      </w:r>
+    </w:p>
+    <w:p>
+      <w:pPr>
         <w:pStyle w:val="Heading2"/>
         <w:spacing w:after="100" w:before="220"/>
       </w:pPr>
@@ -2294,6 +2862,62 @@
     </w:p>
     <w:p>
       <w:pPr>
+        <w:spacing w:after="60"/>
+      </w:pPr>
+      <w:r>
+        <w:rPr>
+          <w:rFonts w:ascii="Calibri" w:cs="Calibri" w:eastAsia="Calibri" w:hAnsi="Calibri"/>
+          <w:b/>
+          <w:bCs/>
+          <w:color w:val="C62828"/>
+          <w:sz w:val="23"/>
+          <w:szCs w:val="23"/>
+        </w:rPr>
+        <w:t xml:space="preserve">Failure scenarios:</w:t>
+      </w:r>
+    </w:p>
+    <w:p>
+      <w:pPr>
+        <w:pStyle w:val="ListParagraph"/>
+        <w:numPr>
+          <w:ilvl w:val="0"/>
+          <w:numId w:val="2"/>
+        </w:numPr>
+        <w:spacing w:after="100"/>
+      </w:pPr>
+      <w:r>
+        <w:rPr>
+          <w:rFonts w:ascii="Calibri" w:cs="Calibri" w:eastAsia="Calibri" w:hAnsi="Calibri"/>
+          <w:b w:val="false"/>
+          <w:bCs w:val="false"/>
+          <w:sz w:val="23"/>
+          <w:szCs w:val="23"/>
+        </w:rPr>
+        <w:t xml:space="preserve">Connection lost while loading: an error box with a "Retry" button appears in place.</w:t>
+      </w:r>
+    </w:p>
+    <w:p>
+      <w:pPr>
+        <w:pStyle w:val="ListParagraph"/>
+        <w:numPr>
+          <w:ilvl w:val="0"/>
+          <w:numId w:val="2"/>
+        </w:numPr>
+        <w:spacing w:after="100"/>
+      </w:pPr>
+      <w:r>
+        <w:rPr>
+          <w:rFonts w:ascii="Calibri" w:cs="Calibri" w:eastAsia="Calibri" w:hAnsi="Calibri"/>
+          <w:b w:val="false"/>
+          <w:bCs w:val="false"/>
+          <w:sz w:val="23"/>
+          <w:szCs w:val="23"/>
+        </w:rPr>
+        <w:t xml:space="preserve">A server-side error: its message is shown as received, and the screen never crashes.</w:t>
+      </w:r>
+    </w:p>
+    <w:p>
+      <w:pPr>
         <w:pStyle w:val="Heading1"/>
         <w:spacing w:after="160" w:before="320"/>
       </w:pPr>
@@ -2454,6 +3078,42 @@
           <w:szCs w:val="23"/>
         </w:rPr>
         <w:t xml:space="preserve">The mobile app talks to the same server and the same data.</w:t>
+      </w:r>
+    </w:p>
+    <w:p>
+      <w:pPr>
+        <w:spacing w:after="60"/>
+      </w:pPr>
+      <w:r>
+        <w:rPr>
+          <w:rFonts w:ascii="Calibri" w:cs="Calibri" w:eastAsia="Calibri" w:hAnsi="Calibri"/>
+          <w:b/>
+          <w:bCs/>
+          <w:color w:val="C62828"/>
+          <w:sz w:val="23"/>
+          <w:szCs w:val="23"/>
+        </w:rPr>
+        <w:t xml:space="preserve">Failure scenarios:</w:t>
+      </w:r>
+    </w:p>
+    <w:p>
+      <w:pPr>
+        <w:pStyle w:val="ListParagraph"/>
+        <w:numPr>
+          <w:ilvl w:val="0"/>
+          <w:numId w:val="2"/>
+        </w:numPr>
+        <w:spacing w:after="100"/>
+      </w:pPr>
+      <w:r>
+        <w:rPr>
+          <w:rFonts w:ascii="Calibri" w:cs="Calibri" w:eastAsia="Calibri" w:hAnsi="Calibri"/>
+          <w:b w:val="false"/>
+          <w:bCs w:val="false"/>
+          <w:sz w:val="23"/>
+          <w:szCs w:val="23"/>
+        </w:rPr>
+        <w:t xml:space="preserve">Temporary hosting outage: both the app and the website show a clear connection error with retry, instead of crashing.</w:t>
       </w:r>
     </w:p>
     <w:p>

</xml_diff>